<commit_message>
update lab 3 report
</commit_message>
<xml_diff>
--- a/Lab2_Report.docx
+++ b/Lab2_Report.docx
@@ -184,7 +184,7 @@
           <w:sz w:val="36"/>
           <w:szCs w:val="32"/>
         </w:rPr>
-        <w:t>3</w:t>
+        <w:t>2</w:t>
       </w:r>
       <w:r>
         <w:rPr>
@@ -3632,7 +3632,6 @@
         <w:rPr>
           <w:rFonts w:ascii="Arial" w:hAnsi="Arial" w:cs="Arial"/>
         </w:rPr>
-        <w:lastRenderedPageBreak/>
         <w:t>Starting from the agent's current position, it first visits all adjacent tiles (distance 1), then all tiles at distance 2, and so on.</w:t>
       </w:r>
     </w:p>
@@ -7004,7 +7003,6 @@
           <w:b/>
           <w:bCs/>
         </w:rPr>
-        <w:lastRenderedPageBreak/>
         <w:t>Move-to Logic</w:t>
       </w:r>
     </w:p>
@@ -8446,7 +8444,6 @@
           <w:b/>
           <w:bCs/>
         </w:rPr>
-        <w:lastRenderedPageBreak/>
         <w:t>Performance Comparison with Obstacles (wall bias = 0.2)</w:t>
       </w:r>
     </w:p>
@@ -9885,14 +9882,7 @@
         <w:rPr>
           <w:rFonts w:ascii="Arial" w:hAnsi="Arial" w:cs="Arial"/>
         </w:rPr>
-        <w:t xml:space="preserve">With obstacles, scores decrease for both algorithms because there are fewer dirt tiles to clean (walls replace some dirt) and navigation requires more steps. Notably, </w:t>
-      </w:r>
-      <w:r>
-        <w:rPr>
-          <w:rFonts w:ascii="Arial" w:hAnsi="Arial" w:cs="Arial"/>
-        </w:rPr>
-        <w:lastRenderedPageBreak/>
-        <w:t>DFS scores become negative on larger grids with obstacles (e.g., −1,476 for 20×20), meaning the penalties outweigh the rewards.</w:t>
+        <w:t>With obstacles, scores decrease for both algorithms because there are fewer dirt tiles to clean (walls replace some dirt) and navigation requires more steps. Notably, DFS scores become negative on larger grids with obstacles (e.g., −1,476 for 20×20), meaning the penalties outweigh the rewards.</w:t>
       </w:r>
     </w:p>
     <w:p>

</xml_diff>